<commit_message>
Testing the Cache Change
</commit_message>
<xml_diff>
--- a/Stravon_SDK_v1_Checklist.docx
+++ b/Stravon_SDK_v1_Checklist.docx
@@ -36,10 +36,10 @@
       </w:pPr>
       <w:r>
         <w:rPr>
-          <w:i/>
-          <w:iCs/>
+          <w:b/>
+          <w:bCs/>
         </w:rPr>
-        <w:t xml:space="preserve">Status: In progress. Repo scaffolded, tooling fixed 8/8/2026. Source files not yet written.</w:t>
+        <w:t xml:space="preserve">Status: CLOSED. All source, build, distribution, and live-verification items confirmed against real terminal output and Supabase call_logs, 9/8/2026.</w:t>
       </w:r>
     </w:p>
     <w:p>
@@ -171,6 +171,48 @@
           </w:tcPr>
           <w:p>
             <w:r>
+              <w:t xml:space="preserve">github.com/Dev-Njagi-James/stravon-management-S.C.A.L.E-SDK</w:t>
+            </w:r>
+          </w:p>
+        </w:tc>
+      </w:tr>
+      <w:tr>
+        <w:tc>
+          <w:tcPr>
+            <w:tcW w:type="dxa" w:w="5400"/>
+          </w:tcPr>
+          <w:p>
+            <w:r>
+              <w:t xml:space="preserve">npm init, TypeScript + tsup installed as devDependencies</w:t>
+            </w:r>
+          </w:p>
+        </w:tc>
+        <w:tc>
+          <w:tcPr>
+            <w:tcW w:type="dxa" w:w="1200"/>
+          </w:tcPr>
+          <w:p>
+            <w:r>
+              <w:t xml:space="preserve">✓</w:t>
+            </w:r>
+          </w:p>
+        </w:tc>
+        <w:tc>
+          <w:tcPr>
+            <w:tcW w:type="dxa" w:w="1200"/>
+          </w:tcPr>
+          <w:p>
+            <w:r>
+              <w:t xml:space="preserve">8/8/2026</w:t>
+            </w:r>
+          </w:p>
+        </w:tc>
+        <w:tc>
+          <w:tcPr>
+            <w:tcW w:type="dxa" w:w="1560"/>
+          </w:tcPr>
+          <w:p>
+            <w:r>
               <w:t xml:space="preserve"/>
             </w:r>
           </w:p>
@@ -183,7 +225,7 @@
           </w:tcPr>
           <w:p>
             <w:r>
-              <w:t xml:space="preserve">npm init, TypeScript + tsup installed as devDependencies</w:t>
+              <w:t xml:space="preserve">tsconfig.json created and valid</w:t>
             </w:r>
           </w:p>
         </w:tc>
@@ -213,19 +255,19 @@
           </w:tcPr>
           <w:p>
             <w:r>
-              <w:t xml:space="preserve"/>
-            </w:r>
-          </w:p>
-        </w:tc>
-      </w:tr>
-      <w:tr>
-        <w:tc>
-          <w:tcPr>
-            <w:tcW w:type="dxa" w:w="5400"/>
-          </w:tcPr>
-          <w:p>
-            <w:r>
-              <w:t xml:space="preserve">tsconfig.json created and valid</w:t>
+              <w:t xml:space="preserve">rootDir: ./src added to fix TS6059 error</w:t>
+            </w:r>
+          </w:p>
+        </w:tc>
+      </w:tr>
+      <w:tr>
+        <w:tc>
+          <w:tcPr>
+            <w:tcW w:type="dxa" w:w="5400"/>
+          </w:tcPr>
+          <w:p>
+            <w:r>
+              <w:t xml:space="preserve">package.json valid (single JSON object, main/types/files set)</w:t>
             </w:r>
           </w:p>
         </w:tc>
@@ -255,19 +297,19 @@
           </w:tcPr>
           <w:p>
             <w:r>
-              <w:t xml:space="preserve">rootDir: ./src added to fix TS6059 error</w:t>
-            </w:r>
-          </w:p>
-        </w:tc>
-      </w:tr>
-      <w:tr>
-        <w:tc>
-          <w:tcPr>
-            <w:tcW w:type="dxa" w:w="5400"/>
-          </w:tcPr>
-          <w:p>
-            <w:r>
-              <w:t xml:space="preserve">package.json valid (single JSON object, main/types/files set)</w:t>
+              <w:t xml:space="preserve">Fixed duplicate-object JSON error</w:t>
+            </w:r>
+          </w:p>
+        </w:tc>
+      </w:tr>
+      <w:tr>
+        <w:tc>
+          <w:tcPr>
+            <w:tcW w:type="dxa" w:w="5400"/>
+          </w:tcPr>
+          <w:p>
+            <w:r>
+              <w:t xml:space="preserve">git init, .gitignore excludes node_modules, .env*</w:t>
             </w:r>
           </w:p>
         </w:tc>
@@ -297,19 +339,19 @@
           </w:tcPr>
           <w:p>
             <w:r>
-              <w:t xml:space="preserve">Fixed duplicate-object JSON error</w:t>
-            </w:r>
-          </w:p>
-        </w:tc>
-      </w:tr>
-      <w:tr>
-        <w:tc>
-          <w:tcPr>
-            <w:tcW w:type="dxa" w:w="5400"/>
-          </w:tcPr>
-          <w:p>
-            <w:r>
-              <w:t xml:space="preserve">git init, .gitignore excludes node_modules, dist, .env*</w:t>
+              <w:t xml:space="preserve">dist/ later un-excluded, see Release section</w:t>
+            </w:r>
+          </w:p>
+        </w:tc>
+      </w:tr>
+      <w:tr>
+        <w:tc>
+          <w:tcPr>
+            <w:tcW w:type="dxa" w:w="5400"/>
+          </w:tcPr>
+          <w:p>
+            <w:r>
+              <w:t xml:space="preserve">src/ folder structure created (index.ts, client.ts, storage.ts, errors.ts)</w:t>
             </w:r>
           </w:p>
         </w:tc>
@@ -330,48 +372,6 @@
           <w:p>
             <w:r>
               <w:t xml:space="preserve">8/8/2026</w:t>
-            </w:r>
-          </w:p>
-        </w:tc>
-        <w:tc>
-          <w:tcPr>
-            <w:tcW w:type="dxa" w:w="1560"/>
-          </w:tcPr>
-          <w:p>
-            <w:r>
-              <w:t xml:space="preserve"/>
-            </w:r>
-          </w:p>
-        </w:tc>
-      </w:tr>
-      <w:tr>
-        <w:tc>
-          <w:tcPr>
-            <w:tcW w:type="dxa" w:w="5400"/>
-          </w:tcPr>
-          <w:p>
-            <w:r>
-              <w:t xml:space="preserve">src/ folder structure created (index.ts, client.ts, storage.ts, errors.ts)</w:t>
-            </w:r>
-          </w:p>
-        </w:tc>
-        <w:tc>
-          <w:tcPr>
-            <w:tcW w:type="dxa" w:w="1200"/>
-          </w:tcPr>
-          <w:p>
-            <w:r>
-              <w:t xml:space="preserve"/>
-            </w:r>
-          </w:p>
-        </w:tc>
-        <w:tc>
-          <w:tcPr>
-            <w:tcW w:type="dxa" w:w="1200"/>
-          </w:tcPr>
-          <w:p>
-            <w:r>
-              <w:t xml:space="preserve"/>
             </w:r>
           </w:p>
         </w:tc>
@@ -505,13 +505,149 @@
           </w:tcPr>
           <w:p>
             <w:r>
+              <w:t xml:space="preserve">✓</w:t>
+            </w:r>
+          </w:p>
+        </w:tc>
+        <w:tc>
+          <w:tcPr>
+            <w:tcW w:type="dxa" w:w="1200"/>
+          </w:tcPr>
+          <w:p>
+            <w:r>
+              <w:t xml:space="preserve">8/8/2026</w:t>
+            </w:r>
+          </w:p>
+        </w:tc>
+        <w:tc>
+          <w:tcPr>
+            <w:tcW w:type="dxa" w:w="1560"/>
+          </w:tcPr>
+          <w:p>
+            <w:r>
+              <w:t xml:space="preserve">Named ScaleError, extends native Error</w:t>
+            </w:r>
+          </w:p>
+        </w:tc>
+      </w:tr>
+      <w:tr>
+        <w:tc>
+          <w:tcPr>
+            <w:tcW w:type="dxa" w:w="5400"/>
+          </w:tcPr>
+          <w:p>
+            <w:r>
+              <w:t xml:space="preserve">AuthError (401)</w:t>
+            </w:r>
+          </w:p>
+        </w:tc>
+        <w:tc>
+          <w:tcPr>
+            <w:tcW w:type="dxa" w:w="1200"/>
+          </w:tcPr>
+          <w:p>
+            <w:r>
+              <w:t xml:space="preserve">✓</w:t>
+            </w:r>
+          </w:p>
+        </w:tc>
+        <w:tc>
+          <w:tcPr>
+            <w:tcW w:type="dxa" w:w="1200"/>
+          </w:tcPr>
+          <w:p>
+            <w:r>
+              <w:t xml:space="preserve">8/8/2026</w:t>
+            </w:r>
+          </w:p>
+        </w:tc>
+        <w:tc>
+          <w:tcPr>
+            <w:tcW w:type="dxa" w:w="1560"/>
+          </w:tcPr>
+          <w:p>
+            <w:r>
               <w:t xml:space="preserve"/>
             </w:r>
           </w:p>
         </w:tc>
-        <w:tc>
-          <w:tcPr>
-            <w:tcW w:type="dxa" w:w="1200"/>
+      </w:tr>
+      <w:tr>
+        <w:tc>
+          <w:tcPr>
+            <w:tcW w:type="dxa" w:w="5400"/>
+          </w:tcPr>
+          <w:p>
+            <w:r>
+              <w:t xml:space="preserve">RateLimitError (429), carries retryAfterMs</w:t>
+            </w:r>
+          </w:p>
+        </w:tc>
+        <w:tc>
+          <w:tcPr>
+            <w:tcW w:type="dxa" w:w="1200"/>
+          </w:tcPr>
+          <w:p>
+            <w:r>
+              <w:t xml:space="preserve">✓</w:t>
+            </w:r>
+          </w:p>
+        </w:tc>
+        <w:tc>
+          <w:tcPr>
+            <w:tcW w:type="dxa" w:w="1200"/>
+          </w:tcPr>
+          <w:p>
+            <w:r>
+              <w:t xml:space="preserve">8/8/2026</w:t>
+            </w:r>
+          </w:p>
+        </w:tc>
+        <w:tc>
+          <w:tcPr>
+            <w:tcW w:type="dxa" w:w="1560"/>
+          </w:tcPr>
+          <w:p>
+            <w:r>
+              <w:t xml:space="preserve">Matches backend body { error, retryAfterMs }</w:t>
+            </w:r>
+          </w:p>
+        </w:tc>
+      </w:tr>
+      <w:tr>
+        <w:tc>
+          <w:tcPr>
+            <w:tcW w:type="dxa" w:w="5400"/>
+          </w:tcPr>
+          <w:p>
+            <w:r>
+              <w:t xml:space="preserve">ValidationError (400-class)</w:t>
+            </w:r>
+          </w:p>
+        </w:tc>
+        <w:tc>
+          <w:tcPr>
+            <w:tcW w:type="dxa" w:w="1200"/>
+          </w:tcPr>
+          <w:p>
+            <w:r>
+              <w:t xml:space="preserve">✓</w:t>
+            </w:r>
+          </w:p>
+        </w:tc>
+        <w:tc>
+          <w:tcPr>
+            <w:tcW w:type="dxa" w:w="1200"/>
+          </w:tcPr>
+          <w:p>
+            <w:r>
+              <w:t xml:space="preserve">8/8/2026</w:t>
+            </w:r>
+          </w:p>
+        </w:tc>
+        <w:tc>
+          <w:tcPr>
+            <w:tcW w:type="dxa" w:w="1560"/>
           </w:tcPr>
           <w:p>
             <w:r>
@@ -519,6 +655,38 @@
             </w:r>
           </w:p>
         </w:tc>
+      </w:tr>
+      <w:tr>
+        <w:tc>
+          <w:tcPr>
+            <w:tcW w:type="dxa" w:w="5400"/>
+          </w:tcPr>
+          <w:p>
+            <w:r>
+              <w:t xml:space="preserve">ServerError (5xx)</w:t>
+            </w:r>
+          </w:p>
+        </w:tc>
+        <w:tc>
+          <w:tcPr>
+            <w:tcW w:type="dxa" w:w="1200"/>
+          </w:tcPr>
+          <w:p>
+            <w:r>
+              <w:t xml:space="preserve">✓</w:t>
+            </w:r>
+          </w:p>
+        </w:tc>
+        <w:tc>
+          <w:tcPr>
+            <w:tcW w:type="dxa" w:w="1200"/>
+          </w:tcPr>
+          <w:p>
+            <w:r>
+              <w:t xml:space="preserve">8/8/2026</w:t>
+            </w:r>
+          </w:p>
+        </w:tc>
         <w:tc>
           <w:tcPr>
             <w:tcW w:type="dxa" w:w="1560"/>
@@ -537,174 +705,6 @@
           </w:tcPr>
           <w:p>
             <w:r>
-              <w:t xml:space="preserve">AuthError (401)</w:t>
-            </w:r>
-          </w:p>
-        </w:tc>
-        <w:tc>
-          <w:tcPr>
-            <w:tcW w:type="dxa" w:w="1200"/>
-          </w:tcPr>
-          <w:p>
-            <w:r>
-              <w:t xml:space="preserve"/>
-            </w:r>
-          </w:p>
-        </w:tc>
-        <w:tc>
-          <w:tcPr>
-            <w:tcW w:type="dxa" w:w="1200"/>
-          </w:tcPr>
-          <w:p>
-            <w:r>
-              <w:t xml:space="preserve"/>
-            </w:r>
-          </w:p>
-        </w:tc>
-        <w:tc>
-          <w:tcPr>
-            <w:tcW w:type="dxa" w:w="1560"/>
-          </w:tcPr>
-          <w:p>
-            <w:r>
-              <w:t xml:space="preserve"/>
-            </w:r>
-          </w:p>
-        </w:tc>
-      </w:tr>
-      <w:tr>
-        <w:tc>
-          <w:tcPr>
-            <w:tcW w:type="dxa" w:w="5400"/>
-          </w:tcPr>
-          <w:p>
-            <w:r>
-              <w:t xml:space="preserve">RateLimitError (429), carries retryAfterMs</w:t>
-            </w:r>
-          </w:p>
-        </w:tc>
-        <w:tc>
-          <w:tcPr>
-            <w:tcW w:type="dxa" w:w="1200"/>
-          </w:tcPr>
-          <w:p>
-            <w:r>
-              <w:t xml:space="preserve"/>
-            </w:r>
-          </w:p>
-        </w:tc>
-        <w:tc>
-          <w:tcPr>
-            <w:tcW w:type="dxa" w:w="1200"/>
-          </w:tcPr>
-          <w:p>
-            <w:r>
-              <w:t xml:space="preserve"/>
-            </w:r>
-          </w:p>
-        </w:tc>
-        <w:tc>
-          <w:tcPr>
-            <w:tcW w:type="dxa" w:w="1560"/>
-          </w:tcPr>
-          <w:p>
-            <w:r>
-              <w:t xml:space="preserve">Must match backend's actual 429 body shape</w:t>
-            </w:r>
-          </w:p>
-        </w:tc>
-      </w:tr>
-      <w:tr>
-        <w:tc>
-          <w:tcPr>
-            <w:tcW w:type="dxa" w:w="5400"/>
-          </w:tcPr>
-          <w:p>
-            <w:r>
-              <w:t xml:space="preserve">ValidationError (400-class)</w:t>
-            </w:r>
-          </w:p>
-        </w:tc>
-        <w:tc>
-          <w:tcPr>
-            <w:tcW w:type="dxa" w:w="1200"/>
-          </w:tcPr>
-          <w:p>
-            <w:r>
-              <w:t xml:space="preserve"/>
-            </w:r>
-          </w:p>
-        </w:tc>
-        <w:tc>
-          <w:tcPr>
-            <w:tcW w:type="dxa" w:w="1200"/>
-          </w:tcPr>
-          <w:p>
-            <w:r>
-              <w:t xml:space="preserve"/>
-            </w:r>
-          </w:p>
-        </w:tc>
-        <w:tc>
-          <w:tcPr>
-            <w:tcW w:type="dxa" w:w="1560"/>
-          </w:tcPr>
-          <w:p>
-            <w:r>
-              <w:t xml:space="preserve"/>
-            </w:r>
-          </w:p>
-        </w:tc>
-      </w:tr>
-      <w:tr>
-        <w:tc>
-          <w:tcPr>
-            <w:tcW w:type="dxa" w:w="5400"/>
-          </w:tcPr>
-          <w:p>
-            <w:r>
-              <w:t xml:space="preserve">ServerError (5xx)</w:t>
-            </w:r>
-          </w:p>
-        </w:tc>
-        <w:tc>
-          <w:tcPr>
-            <w:tcW w:type="dxa" w:w="1200"/>
-          </w:tcPr>
-          <w:p>
-            <w:r>
-              <w:t xml:space="preserve"/>
-            </w:r>
-          </w:p>
-        </w:tc>
-        <w:tc>
-          <w:tcPr>
-            <w:tcW w:type="dxa" w:w="1200"/>
-          </w:tcPr>
-          <w:p>
-            <w:r>
-              <w:t xml:space="preserve"/>
-            </w:r>
-          </w:p>
-        </w:tc>
-        <w:tc>
-          <w:tcPr>
-            <w:tcW w:type="dxa" w:w="1560"/>
-          </w:tcPr>
-          <w:p>
-            <w:r>
-              <w:t xml:space="preserve"/>
-            </w:r>
-          </w:p>
-        </w:tc>
-      </w:tr>
-      <w:tr>
-        <w:tc>
-          <w:tcPr>
-            <w:tcW w:type="dxa" w:w="5400"/>
-          </w:tcPr>
-          <w:p>
-            <w:r>
               <w:t xml:space="preserve">TimeoutError (client-side fetch timeout)</w:t>
             </w:r>
           </w:p>
@@ -715,27 +715,27 @@
           </w:tcPr>
           <w:p>
             <w:r>
-              <w:t xml:space="preserve"/>
-            </w:r>
-          </w:p>
-        </w:tc>
-        <w:tc>
-          <w:tcPr>
-            <w:tcW w:type="dxa" w:w="1200"/>
-          </w:tcPr>
-          <w:p>
-            <w:r>
-              <w:t xml:space="preserve"/>
-            </w:r>
-          </w:p>
-        </w:tc>
-        <w:tc>
-          <w:tcPr>
-            <w:tcW w:type="dxa" w:w="1560"/>
-          </w:tcPr>
-          <w:p>
-            <w:r>
-              <w:t xml:space="preserve">Default timeout value not yet decided</w:t>
+              <w:t xml:space="preserve">✓</w:t>
+            </w:r>
+          </w:p>
+        </w:tc>
+        <w:tc>
+          <w:tcPr>
+            <w:tcW w:type="dxa" w:w="1200"/>
+          </w:tcPr>
+          <w:p>
+            <w:r>
+              <w:t xml:space="preserve">8/8/2026</w:t>
+            </w:r>
+          </w:p>
+        </w:tc>
+        <w:tc>
+          <w:tcPr>
+            <w:tcW w:type="dxa" w:w="1560"/>
+          </w:tcPr>
+          <w:p>
+            <w:r>
+              <w:t xml:space="preserve">Default fixed at 10s</w:t>
             </w:r>
           </w:p>
         </w:tc>
@@ -840,13 +840,75 @@
           </w:tcPr>
           <w:p>
             <w:r>
-              <w:t xml:space="preserve">StravonClient constructor: apiKey + optional baseUrl</w:t>
-            </w:r>
-          </w:p>
-        </w:tc>
-        <w:tc>
-          <w:tcPr>
-            <w:tcW w:type="dxa" w:w="1200"/>
+              <w:t xml:space="preserve">ScaleClient constructor: apiKey + optional baseUrl</w:t>
+            </w:r>
+          </w:p>
+        </w:tc>
+        <w:tc>
+          <w:tcPr>
+            <w:tcW w:type="dxa" w:w="1200"/>
+          </w:tcPr>
+          <w:p>
+            <w:r>
+              <w:t xml:space="preserve">✓</w:t>
+            </w:r>
+          </w:p>
+        </w:tc>
+        <w:tc>
+          <w:tcPr>
+            <w:tcW w:type="dxa" w:w="1200"/>
+          </w:tcPr>
+          <w:p>
+            <w:r>
+              <w:t xml:space="preserve">8/8/2026</w:t>
+            </w:r>
+          </w:p>
+        </w:tc>
+        <w:tc>
+          <w:tcPr>
+            <w:tcW w:type="dxa" w:w="1560"/>
+          </w:tcPr>
+          <w:p>
+            <w:r>
+              <w:t xml:space="preserve">Renamed from StravonClient</w:t>
+            </w:r>
+          </w:p>
+        </w:tc>
+      </w:tr>
+      <w:tr>
+        <w:tc>
+          <w:tcPr>
+            <w:tcW w:type="dxa" w:w="5400"/>
+          </w:tcPr>
+          <w:p>
+            <w:r>
+              <w:t xml:space="preserve">Version prefix (/v1/) baked in at client level</w:t>
+            </w:r>
+          </w:p>
+        </w:tc>
+        <w:tc>
+          <w:tcPr>
+            <w:tcW w:type="dxa" w:w="1200"/>
+          </w:tcPr>
+          <w:p>
+            <w:r>
+              <w:t xml:space="preserve">✓</w:t>
+            </w:r>
+          </w:p>
+        </w:tc>
+        <w:tc>
+          <w:tcPr>
+            <w:tcW w:type="dxa" w:w="1200"/>
+          </w:tcPr>
+          <w:p>
+            <w:r>
+              <w:t xml:space="preserve">8/8/2026</w:t>
+            </w:r>
+          </w:p>
+        </w:tc>
+        <w:tc>
+          <w:tcPr>
+            <w:tcW w:type="dxa" w:w="1560"/>
           </w:tcPr>
           <w:p>
             <w:r>
@@ -854,68 +916,6 @@
             </w:r>
           </w:p>
         </w:tc>
-        <w:tc>
-          <w:tcPr>
-            <w:tcW w:type="dxa" w:w="1200"/>
-          </w:tcPr>
-          <w:p>
-            <w:r>
-              <w:t xml:space="preserve"/>
-            </w:r>
-          </w:p>
-        </w:tc>
-        <w:tc>
-          <w:tcPr>
-            <w:tcW w:type="dxa" w:w="1560"/>
-          </w:tcPr>
-          <w:p>
-            <w:r>
-              <w:t xml:space="preserve"/>
-            </w:r>
-          </w:p>
-        </w:tc>
-      </w:tr>
-      <w:tr>
-        <w:tc>
-          <w:tcPr>
-            <w:tcW w:type="dxa" w:w="5400"/>
-          </w:tcPr>
-          <w:p>
-            <w:r>
-              <w:t xml:space="preserve">Version prefix (/v1/) baked in at client level</w:t>
-            </w:r>
-          </w:p>
-        </w:tc>
-        <w:tc>
-          <w:tcPr>
-            <w:tcW w:type="dxa" w:w="1200"/>
-          </w:tcPr>
-          <w:p>
-            <w:r>
-              <w:t xml:space="preserve"/>
-            </w:r>
-          </w:p>
-        </w:tc>
-        <w:tc>
-          <w:tcPr>
-            <w:tcW w:type="dxa" w:w="1200"/>
-          </w:tcPr>
-          <w:p>
-            <w:r>
-              <w:t xml:space="preserve"/>
-            </w:r>
-          </w:p>
-        </w:tc>
-        <w:tc>
-          <w:tcPr>
-            <w:tcW w:type="dxa" w:w="1560"/>
-          </w:tcPr>
-          <w:p>
-            <w:r>
-              <w:t xml:space="preserve"/>
-            </w:r>
-          </w:p>
-        </w:tc>
       </w:tr>
       <w:tr>
         <w:tc>
@@ -934,27 +934,27 @@
           </w:tcPr>
           <w:p>
             <w:r>
-              <w:t xml:space="preserve"/>
-            </w:r>
-          </w:p>
-        </w:tc>
-        <w:tc>
-          <w:tcPr>
-            <w:tcW w:type="dxa" w:w="1200"/>
-          </w:tcPr>
-          <w:p>
-            <w:r>
-              <w:t xml:space="preserve"/>
-            </w:r>
-          </w:p>
-        </w:tc>
-        <w:tc>
-          <w:tcPr>
-            <w:tcW w:type="dxa" w:w="1560"/>
-          </w:tcPr>
-          <w:p>
-            <w:r>
-              <w:t xml:space="preserve"/>
+              <w:t xml:space="preserve">✓</w:t>
+            </w:r>
+          </w:p>
+        </w:tc>
+        <w:tc>
+          <w:tcPr>
+            <w:tcW w:type="dxa" w:w="1200"/>
+          </w:tcPr>
+          <w:p>
+            <w:r>
+              <w:t xml:space="preserve">8/8/2026</w:t>
+            </w:r>
+          </w:p>
+        </w:tc>
+        <w:tc>
+          <w:tcPr>
+            <w:tcW w:type="dxa" w:w="1560"/>
+          </w:tcPr>
+          <w:p>
+            <w:r>
+              <w:t xml:space="preserve">x-api-key header</w:t>
             </w:r>
           </w:p>
         </w:tc>
@@ -976,27 +976,27 @@
           </w:tcPr>
           <w:p>
             <w:r>
-              <w:t xml:space="preserve"/>
-            </w:r>
-          </w:p>
-        </w:tc>
-        <w:tc>
-          <w:tcPr>
-            <w:tcW w:type="dxa" w:w="1200"/>
-          </w:tcPr>
-          <w:p>
-            <w:r>
-              <w:t xml:space="preserve"/>
-            </w:r>
-          </w:p>
-        </w:tc>
-        <w:tc>
-          <w:tcPr>
-            <w:tcW w:type="dxa" w:w="1560"/>
-          </w:tcPr>
-          <w:p>
-            <w:r>
-              <w:t xml:space="preserve"/>
+              <w:t xml:space="preserve">✓</w:t>
+            </w:r>
+          </w:p>
+        </w:tc>
+        <w:tc>
+          <w:tcPr>
+            <w:tcW w:type="dxa" w:w="1200"/>
+          </w:tcPr>
+          <w:p>
+            <w:r>
+              <w:t xml:space="preserve">8/8/2026</w:t>
+            </w:r>
+          </w:p>
+        </w:tc>
+        <w:tc>
+          <w:tcPr>
+            <w:tcW w:type="dxa" w:w="1560"/>
+          </w:tcPr>
+          <w:p>
+            <w:r>
+              <w:t xml:space="preserve">10s, AbortController</w:t>
             </w:r>
           </w:p>
         </w:tc>
@@ -1018,27 +1018,27 @@
           </w:tcPr>
           <w:p>
             <w:r>
-              <w:t xml:space="preserve"/>
-            </w:r>
-          </w:p>
-        </w:tc>
-        <w:tc>
-          <w:tcPr>
-            <w:tcW w:type="dxa" w:w="1200"/>
-          </w:tcPr>
-          <w:p>
-            <w:r>
-              <w:t xml:space="preserve"/>
-            </w:r>
-          </w:p>
-        </w:tc>
-        <w:tc>
-          <w:tcPr>
-            <w:tcW w:type="dxa" w:w="1560"/>
-          </w:tcPr>
-          <w:p>
-            <w:r>
-              <w:t xml:space="preserve"/>
+              <w:t xml:space="preserve">✓</w:t>
+            </w:r>
+          </w:p>
+        </w:tc>
+        <w:tc>
+          <w:tcPr>
+            <w:tcW w:type="dxa" w:w="1200"/>
+          </w:tcPr>
+          <w:p>
+            <w:r>
+              <w:t xml:space="preserve">8/8/2026</w:t>
+            </w:r>
+          </w:p>
+        </w:tc>
+        <w:tc>
+          <w:tcPr>
+            <w:tcW w:type="dxa" w:w="1560"/>
+          </w:tcPr>
+          <w:p>
+            <w:r>
+              <w:t xml:space="preserve">401/429/4xx/5xx mapped, body read once</w:t>
             </w:r>
           </w:p>
         </w:tc>
@@ -1060,17 +1060,17 @@
           </w:tcPr>
           <w:p>
             <w:r>
-              <w:t xml:space="preserve"/>
-            </w:r>
-          </w:p>
-        </w:tc>
-        <w:tc>
-          <w:tcPr>
-            <w:tcW w:type="dxa" w:w="1200"/>
-          </w:tcPr>
-          <w:p>
-            <w:r>
-              <w:t xml:space="preserve"/>
+              <w:t xml:space="preserve">✓</w:t>
+            </w:r>
+          </w:p>
+        </w:tc>
+        <w:tc>
+          <w:tcPr>
+            <w:tcW w:type="dxa" w:w="1200"/>
+          </w:tcPr>
+          <w:p>
+            <w:r>
+              <w:t xml:space="preserve">8/8/2026</w:t>
             </w:r>
           </w:p>
         </w:tc>
@@ -1195,27 +1195,27 @@
           </w:tcPr>
           <w:p>
             <w:r>
-              <w:t xml:space="preserve"/>
-            </w:r>
-          </w:p>
-        </w:tc>
-        <w:tc>
-          <w:tcPr>
-            <w:tcW w:type="dxa" w:w="1200"/>
-          </w:tcPr>
-          <w:p>
-            <w:r>
-              <w:t xml:space="preserve"/>
-            </w:r>
-          </w:p>
-        </w:tc>
-        <w:tc>
-          <w:tcPr>
-            <w:tcW w:type="dxa" w:w="1560"/>
-          </w:tcPr>
-          <w:p>
-            <w:r>
-              <w:t xml:space="preserve"/>
+              <w:t xml:space="preserve">✓</w:t>
+            </w:r>
+          </w:p>
+        </w:tc>
+        <w:tc>
+          <w:tcPr>
+            <w:tcW w:type="dxa" w:w="1200"/>
+          </w:tcPr>
+          <w:p>
+            <w:r>
+              <w:t xml:space="preserve">8/8/2026</w:t>
+            </w:r>
+          </w:p>
+        </w:tc>
+        <w:tc>
+          <w:tcPr>
+            <w:tcW w:type="dxa" w:w="1560"/>
+          </w:tcPr>
+          <w:p>
+            <w:r>
+              <w:t xml:space="preserve">Live-verified</w:t>
             </w:r>
           </w:p>
         </w:tc>
@@ -1237,27 +1237,27 @@
           </w:tcPr>
           <w:p>
             <w:r>
-              <w:t xml:space="preserve"/>
-            </w:r>
-          </w:p>
-        </w:tc>
-        <w:tc>
-          <w:tcPr>
-            <w:tcW w:type="dxa" w:w="1200"/>
-          </w:tcPr>
-          <w:p>
-            <w:r>
-              <w:t xml:space="preserve"/>
-            </w:r>
-          </w:p>
-        </w:tc>
-        <w:tc>
-          <w:tcPr>
-            <w:tcW w:type="dxa" w:w="1560"/>
-          </w:tcPr>
-          <w:p>
-            <w:r>
-              <w:t xml:space="preserve"/>
+              <w:t xml:space="preserve">✓</w:t>
+            </w:r>
+          </w:p>
+        </w:tc>
+        <w:tc>
+          <w:tcPr>
+            <w:tcW w:type="dxa" w:w="1200"/>
+          </w:tcPr>
+          <w:p>
+            <w:r>
+              <w:t xml:space="preserve">8/8/2026</w:t>
+            </w:r>
+          </w:p>
+        </w:tc>
+        <w:tc>
+          <w:tcPr>
+            <w:tcW w:type="dxa" w:w="1560"/>
+          </w:tcPr>
+          <w:p>
+            <w:r>
+              <w:t xml:space="preserve">Live-verified, verified:true</w:t>
             </w:r>
           </w:p>
         </w:tc>
@@ -1279,27 +1279,27 @@
           </w:tcPr>
           <w:p>
             <w:r>
-              <w:t xml:space="preserve"/>
-            </w:r>
-          </w:p>
-        </w:tc>
-        <w:tc>
-          <w:tcPr>
-            <w:tcW w:type="dxa" w:w="1200"/>
-          </w:tcPr>
-          <w:p>
-            <w:r>
-              <w:t xml:space="preserve"/>
-            </w:r>
-          </w:p>
-        </w:tc>
-        <w:tc>
-          <w:tcPr>
-            <w:tcW w:type="dxa" w:w="1560"/>
-          </w:tcPr>
-          <w:p>
-            <w:r>
-              <w:t xml:space="preserve"/>
+              <w:t xml:space="preserve">✓</w:t>
+            </w:r>
+          </w:p>
+        </w:tc>
+        <w:tc>
+          <w:tcPr>
+            <w:tcW w:type="dxa" w:w="1200"/>
+          </w:tcPr>
+          <w:p>
+            <w:r>
+              <w:t xml:space="preserve">8/8/2026</w:t>
+            </w:r>
+          </w:p>
+        </w:tc>
+        <w:tc>
+          <w:tcPr>
+            <w:tcW w:type="dxa" w:w="1560"/>
+          </w:tcPr>
+          <w:p>
+            <w:r>
+              <w:t xml:space="preserve">Live-verified</w:t>
             </w:r>
           </w:p>
         </w:tc>
@@ -1321,27 +1321,27 @@
           </w:tcPr>
           <w:p>
             <w:r>
-              <w:t xml:space="preserve"/>
-            </w:r>
-          </w:p>
-        </w:tc>
-        <w:tc>
-          <w:tcPr>
-            <w:tcW w:type="dxa" w:w="1200"/>
-          </w:tcPr>
-          <w:p>
-            <w:r>
-              <w:t xml:space="preserve"/>
-            </w:r>
-          </w:p>
-        </w:tc>
-        <w:tc>
-          <w:tcPr>
-            <w:tcW w:type="dxa" w:w="1560"/>
-          </w:tcPr>
-          <w:p>
-            <w:r>
-              <w:t xml:space="preserve"/>
+              <w:t xml:space="preserve">✓</w:t>
+            </w:r>
+          </w:p>
+        </w:tc>
+        <w:tc>
+          <w:tcPr>
+            <w:tcW w:type="dxa" w:w="1200"/>
+          </w:tcPr>
+          <w:p>
+            <w:r>
+              <w:t xml:space="preserve">8/8/2026</w:t>
+            </w:r>
+          </w:p>
+        </w:tc>
+        <w:tc>
+          <w:tcPr>
+            <w:tcW w:type="dxa" w:w="1560"/>
+          </w:tcPr>
+          <w:p>
+            <w:r>
+              <w:t xml:space="preserve">Live-verified, in-place replace confirmed</w:t>
             </w:r>
           </w:p>
         </w:tc>
@@ -1363,27 +1363,27 @@
           </w:tcPr>
           <w:p>
             <w:r>
-              <w:t xml:space="preserve"/>
-            </w:r>
-          </w:p>
-        </w:tc>
-        <w:tc>
-          <w:tcPr>
-            <w:tcW w:type="dxa" w:w="1200"/>
-          </w:tcPr>
-          <w:p>
-            <w:r>
-              <w:t xml:space="preserve"/>
-            </w:r>
-          </w:p>
-        </w:tc>
-        <w:tc>
-          <w:tcPr>
-            <w:tcW w:type="dxa" w:w="1560"/>
-          </w:tcPr>
-          <w:p>
-            <w:r>
-              <w:t xml:space="preserve"/>
+              <w:t xml:space="preserve">✓</w:t>
+            </w:r>
+          </w:p>
+        </w:tc>
+        <w:tc>
+          <w:tcPr>
+            <w:tcW w:type="dxa" w:w="1200"/>
+          </w:tcPr>
+          <w:p>
+            <w:r>
+              <w:t xml:space="preserve">8/8/2026</w:t>
+            </w:r>
+          </w:p>
+        </w:tc>
+        <w:tc>
+          <w:tcPr>
+            <w:tcW w:type="dxa" w:w="1560"/>
+          </w:tcPr>
+          <w:p>
+            <w:r>
+              <w:t xml:space="preserve">Live-verified</w:t>
             </w:r>
           </w:p>
         </w:tc>
@@ -1405,27 +1405,27 @@
           </w:tcPr>
           <w:p>
             <w:r>
-              <w:t xml:space="preserve"/>
-            </w:r>
-          </w:p>
-        </w:tc>
-        <w:tc>
-          <w:tcPr>
-            <w:tcW w:type="dxa" w:w="1200"/>
-          </w:tcPr>
-          <w:p>
-            <w:r>
-              <w:t xml:space="preserve"/>
-            </w:r>
-          </w:p>
-        </w:tc>
-        <w:tc>
-          <w:tcPr>
-            <w:tcW w:type="dxa" w:w="1560"/>
-          </w:tcPr>
-          <w:p>
-            <w:r>
-              <w:t xml:space="preserve">No retry on PUT step</w:t>
+              <w:t xml:space="preserve">✓</w:t>
+            </w:r>
+          </w:p>
+        </w:tc>
+        <w:tc>
+          <w:tcPr>
+            <w:tcW w:type="dxa" w:w="1200"/>
+          </w:tcPr>
+          <w:p>
+            <w:r>
+              <w:t xml:space="preserve">8/8/2026</w:t>
+            </w:r>
+          </w:p>
+        </w:tc>
+        <w:tc>
+          <w:tcPr>
+            <w:tcW w:type="dxa" w:w="1560"/>
+          </w:tcPr>
+          <w:p>
+            <w:r>
+              <w:t xml:space="preserve">No retry on PUT step, live-verified</w:t>
             </w:r>
           </w:p>
         </w:tc>
@@ -1447,17 +1447,17 @@
           </w:tcPr>
           <w:p>
             <w:r>
-              <w:t xml:space="preserve"/>
-            </w:r>
-          </w:p>
-        </w:tc>
-        <w:tc>
-          <w:tcPr>
-            <w:tcW w:type="dxa" w:w="1200"/>
-          </w:tcPr>
-          <w:p>
-            <w:r>
-              <w:t xml:space="preserve"/>
+              <w:t xml:space="preserve">✓</w:t>
+            </w:r>
+          </w:p>
+        </w:tc>
+        <w:tc>
+          <w:tcPr>
+            <w:tcW w:type="dxa" w:w="1200"/>
+          </w:tcPr>
+          <w:p>
+            <w:r>
+              <w:t xml:space="preserve">8/8/2026</w:t>
             </w:r>
           </w:p>
         </w:tc>
@@ -1572,79 +1572,79 @@
           </w:tcPr>
           <w:p>
             <w:r>
-              <w:t xml:space="preserve">src/index.ts exports StravonClient</w:t>
-            </w:r>
-          </w:p>
-        </w:tc>
-        <w:tc>
-          <w:tcPr>
-            <w:tcW w:type="dxa" w:w="1200"/>
-          </w:tcPr>
-          <w:p>
-            <w:r>
-              <w:t xml:space="preserve"/>
-            </w:r>
-          </w:p>
-        </w:tc>
-        <w:tc>
-          <w:tcPr>
-            <w:tcW w:type="dxa" w:w="1200"/>
-          </w:tcPr>
-          <w:p>
-            <w:r>
-              <w:t xml:space="preserve"/>
-            </w:r>
-          </w:p>
-        </w:tc>
-        <w:tc>
-          <w:tcPr>
-            <w:tcW w:type="dxa" w:w="1560"/>
-          </w:tcPr>
-          <w:p>
-            <w:r>
-              <w:t xml:space="preserve"/>
-            </w:r>
-          </w:p>
-        </w:tc>
-      </w:tr>
-      <w:tr>
-        <w:tc>
-          <w:tcPr>
-            <w:tcW w:type="dxa" w:w="5400"/>
-          </w:tcPr>
-          <w:p>
-            <w:r>
-              <w:t xml:space="preserve">src/index.ts exports all five error classes</w:t>
-            </w:r>
-          </w:p>
-        </w:tc>
-        <w:tc>
-          <w:tcPr>
-            <w:tcW w:type="dxa" w:w="1200"/>
-          </w:tcPr>
-          <w:p>
-            <w:r>
-              <w:t xml:space="preserve"/>
-            </w:r>
-          </w:p>
-        </w:tc>
-        <w:tc>
-          <w:tcPr>
-            <w:tcW w:type="dxa" w:w="1200"/>
-          </w:tcPr>
-          <w:p>
-            <w:r>
-              <w:t xml:space="preserve"/>
-            </w:r>
-          </w:p>
-        </w:tc>
-        <w:tc>
-          <w:tcPr>
-            <w:tcW w:type="dxa" w:w="1560"/>
-          </w:tcPr>
-          <w:p>
-            <w:r>
-              <w:t xml:space="preserve"/>
+              <w:t xml:space="preserve">src/index.ts exports ScaleClient</w:t>
+            </w:r>
+          </w:p>
+        </w:tc>
+        <w:tc>
+          <w:tcPr>
+            <w:tcW w:type="dxa" w:w="1200"/>
+          </w:tcPr>
+          <w:p>
+            <w:r>
+              <w:t xml:space="preserve">✓</w:t>
+            </w:r>
+          </w:p>
+        </w:tc>
+        <w:tc>
+          <w:tcPr>
+            <w:tcW w:type="dxa" w:w="1200"/>
+          </w:tcPr>
+          <w:p>
+            <w:r>
+              <w:t xml:space="preserve">8/8/2026</w:t>
+            </w:r>
+          </w:p>
+        </w:tc>
+        <w:tc>
+          <w:tcPr>
+            <w:tcW w:type="dxa" w:w="1560"/>
+          </w:tcPr>
+          <w:p>
+            <w:r>
+              <w:t xml:space="preserve">Named export, no default</w:t>
+            </w:r>
+          </w:p>
+        </w:tc>
+      </w:tr>
+      <w:tr>
+        <w:tc>
+          <w:tcPr>
+            <w:tcW w:type="dxa" w:w="5400"/>
+          </w:tcPr>
+          <w:p>
+            <w:r>
+              <w:t xml:space="preserve">src/index.ts exports all six error classes</w:t>
+            </w:r>
+          </w:p>
+        </w:tc>
+        <w:tc>
+          <w:tcPr>
+            <w:tcW w:type="dxa" w:w="1200"/>
+          </w:tcPr>
+          <w:p>
+            <w:r>
+              <w:t xml:space="preserve">✓</w:t>
+            </w:r>
+          </w:p>
+        </w:tc>
+        <w:tc>
+          <w:tcPr>
+            <w:tcW w:type="dxa" w:w="1200"/>
+          </w:tcPr>
+          <w:p>
+            <w:r>
+              <w:t xml:space="preserve">8/8/2026</w:t>
+            </w:r>
+          </w:p>
+        </w:tc>
+        <w:tc>
+          <w:tcPr>
+            <w:tcW w:type="dxa" w:w="1560"/>
+          </w:tcPr>
+          <w:p>
+            <w:r>
+              <w:t xml:space="preserve">ScaleError, AuthError, RateLimitError, ValidationError, ServerError, TimeoutError</w:t>
             </w:r>
           </w:p>
         </w:tc>
@@ -1666,27 +1666,27 @@
           </w:tcPr>
           <w:p>
             <w:r>
-              <w:t xml:space="preserve"/>
-            </w:r>
-          </w:p>
-        </w:tc>
-        <w:tc>
-          <w:tcPr>
-            <w:tcW w:type="dxa" w:w="1200"/>
-          </w:tcPr>
-          <w:p>
-            <w:r>
-              <w:t xml:space="preserve"/>
-            </w:r>
-          </w:p>
-        </w:tc>
-        <w:tc>
-          <w:tcPr>
-            <w:tcW w:type="dxa" w:w="1560"/>
-          </w:tcPr>
-          <w:p>
-            <w:r>
-              <w:t xml:space="preserve"/>
+              <w:t xml:space="preserve">✓</w:t>
+            </w:r>
+          </w:p>
+        </w:tc>
+        <w:tc>
+          <w:tcPr>
+            <w:tcW w:type="dxa" w:w="1200"/>
+          </w:tcPr>
+          <w:p>
+            <w:r>
+              <w:t xml:space="preserve">8/8/2026</w:t>
+            </w:r>
+          </w:p>
+        </w:tc>
+        <w:tc>
+          <w:tcPr>
+            <w:tcW w:type="dxa" w:w="1560"/>
+          </w:tcPr>
+          <w:p>
+            <w:r>
+              <w:t xml:space="preserve">typescript pinned to 5.6.3 to fix rollup-plugin-dts crash</w:t>
             </w:r>
           </w:p>
         </w:tc>
@@ -1801,156 +1801,156 @@
           </w:tcPr>
           <w:p>
             <w:r>
+              <w:t xml:space="preserve">✓</w:t>
+            </w:r>
+          </w:p>
+        </w:tc>
+        <w:tc>
+          <w:tcPr>
+            <w:tcW w:type="dxa" w:w="1200"/>
+          </w:tcPr>
+          <w:p>
+            <w:r>
+              <w:t xml:space="preserve">8/9/2026</w:t>
+            </w:r>
+          </w:p>
+        </w:tc>
+        <w:tc>
+          <w:tcPr>
+            <w:tcW w:type="dxa" w:w="1560"/>
+          </w:tcPr>
+          <w:p>
+            <w:r>
+              <w:t xml:space="preserve">Test project ba21e69c-3ce5-4dcf-9ede-5230b7ee7cad, entry tier</w:t>
+            </w:r>
+          </w:p>
+        </w:tc>
+      </w:tr>
+      <w:tr>
+        <w:tc>
+          <w:tcPr>
+            <w:tcW w:type="dxa" w:w="5400"/>
+          </w:tcPr>
+          <w:p>
+            <w:r>
+              <w:t xml:space="preserve">create() -&gt; real presigned URL returned</w:t>
+            </w:r>
+          </w:p>
+        </w:tc>
+        <w:tc>
+          <w:tcPr>
+            <w:tcW w:type="dxa" w:w="1200"/>
+          </w:tcPr>
+          <w:p>
+            <w:r>
+              <w:t xml:space="preserve">✓</w:t>
+            </w:r>
+          </w:p>
+        </w:tc>
+        <w:tc>
+          <w:tcPr>
+            <w:tcW w:type="dxa" w:w="1200"/>
+          </w:tcPr>
+          <w:p>
+            <w:r>
+              <w:t xml:space="preserve">8/9/2026</w:t>
+            </w:r>
+          </w:p>
+        </w:tc>
+        <w:tc>
+          <w:tcPr>
+            <w:tcW w:type="dxa" w:w="1560"/>
+          </w:tcPr>
+          <w:p>
+            <w:r>
+              <w:t xml:space="preserve">log_id 179 in call_logs, bytes 27, verified</w:t>
+            </w:r>
+          </w:p>
+        </w:tc>
+      </w:tr>
+      <w:tr>
+        <w:tc>
+          <w:tcPr>
+            <w:tcW w:type="dxa" w:w="5400"/>
+          </w:tcPr>
+          <w:p>
+            <w:r>
+              <w:t xml:space="preserve">Real PUT to presigned URL succeeds</w:t>
+            </w:r>
+          </w:p>
+        </w:tc>
+        <w:tc>
+          <w:tcPr>
+            <w:tcW w:type="dxa" w:w="1200"/>
+          </w:tcPr>
+          <w:p>
+            <w:r>
+              <w:t xml:space="preserve">✓</w:t>
+            </w:r>
+          </w:p>
+        </w:tc>
+        <w:tc>
+          <w:tcPr>
+            <w:tcW w:type="dxa" w:w="1200"/>
+          </w:tcPr>
+          <w:p>
+            <w:r>
+              <w:t xml:space="preserve">8/9/2026</w:t>
+            </w:r>
+          </w:p>
+        </w:tc>
+        <w:tc>
+          <w:tcPr>
+            <w:tcW w:type="dxa" w:w="1560"/>
+          </w:tcPr>
+          <w:p>
+            <w:r>
+              <w:t xml:space="preserve">200 status, confirmed twice (create + modify)</w:t>
+            </w:r>
+          </w:p>
+        </w:tc>
+      </w:tr>
+      <w:tr>
+        <w:tc>
+          <w:tcPr>
+            <w:tcW w:type="dxa" w:w="5400"/>
+          </w:tcPr>
+          <w:p>
+            <w:r>
+              <w:t xml:space="preserve">complete() -&gt; verified: true, correct bytes</w:t>
+            </w:r>
+          </w:p>
+        </w:tc>
+        <w:tc>
+          <w:tcPr>
+            <w:tcW w:type="dxa" w:w="1200"/>
+          </w:tcPr>
+          <w:p>
+            <w:r>
+              <w:t xml:space="preserve">✓</w:t>
+            </w:r>
+          </w:p>
+        </w:tc>
+        <w:tc>
+          <w:tcPr>
+            <w:tcW w:type="dxa" w:w="1200"/>
+          </w:tcPr>
+          <w:p>
+            <w:r>
+              <w:t xml:space="preserve">8/9/2026</w:t>
+            </w:r>
+          </w:p>
+        </w:tc>
+        <w:tc>
+          <w:tcPr>
+            <w:tcW w:type="dxa" w:w="1560"/>
+          </w:tcPr>
+          <w:p>
+            <w:r>
               <w:t xml:space="preserve"/>
             </w:r>
           </w:p>
         </w:tc>
-        <w:tc>
-          <w:tcPr>
-            <w:tcW w:type="dxa" w:w="1200"/>
-          </w:tcPr>
-          <w:p>
-            <w:r>
-              <w:t xml:space="preserve"/>
-            </w:r>
-          </w:p>
-        </w:tc>
-        <w:tc>
-          <w:tcPr>
-            <w:tcW w:type="dxa" w:w="1560"/>
-          </w:tcPr>
-          <w:p>
-            <w:r>
-              <w:t xml:space="preserve">https://stravon-management.onrender.com</w:t>
-            </w:r>
-          </w:p>
-        </w:tc>
-      </w:tr>
-      <w:tr>
-        <w:tc>
-          <w:tcPr>
-            <w:tcW w:type="dxa" w:w="5400"/>
-          </w:tcPr>
-          <w:p>
-            <w:r>
-              <w:t xml:space="preserve">create() -&gt; real presigned URL returned</w:t>
-            </w:r>
-          </w:p>
-        </w:tc>
-        <w:tc>
-          <w:tcPr>
-            <w:tcW w:type="dxa" w:w="1200"/>
-          </w:tcPr>
-          <w:p>
-            <w:r>
-              <w:t xml:space="preserve"/>
-            </w:r>
-          </w:p>
-        </w:tc>
-        <w:tc>
-          <w:tcPr>
-            <w:tcW w:type="dxa" w:w="1200"/>
-          </w:tcPr>
-          <w:p>
-            <w:r>
-              <w:t xml:space="preserve"/>
-            </w:r>
-          </w:p>
-        </w:tc>
-        <w:tc>
-          <w:tcPr>
-            <w:tcW w:type="dxa" w:w="1560"/>
-          </w:tcPr>
-          <w:p>
-            <w:r>
-              <w:t xml:space="preserve"/>
-            </w:r>
-          </w:p>
-        </w:tc>
-      </w:tr>
-      <w:tr>
-        <w:tc>
-          <w:tcPr>
-            <w:tcW w:type="dxa" w:w="5400"/>
-          </w:tcPr>
-          <w:p>
-            <w:r>
-              <w:t xml:space="preserve">Real PUT to presigned URL succeeds</w:t>
-            </w:r>
-          </w:p>
-        </w:tc>
-        <w:tc>
-          <w:tcPr>
-            <w:tcW w:type="dxa" w:w="1200"/>
-          </w:tcPr>
-          <w:p>
-            <w:r>
-              <w:t xml:space="preserve"/>
-            </w:r>
-          </w:p>
-        </w:tc>
-        <w:tc>
-          <w:tcPr>
-            <w:tcW w:type="dxa" w:w="1200"/>
-          </w:tcPr>
-          <w:p>
-            <w:r>
-              <w:t xml:space="preserve"/>
-            </w:r>
-          </w:p>
-        </w:tc>
-        <w:tc>
-          <w:tcPr>
-            <w:tcW w:type="dxa" w:w="1560"/>
-          </w:tcPr>
-          <w:p>
-            <w:r>
-              <w:t xml:space="preserve"/>
-            </w:r>
-          </w:p>
-        </w:tc>
-      </w:tr>
-      <w:tr>
-        <w:tc>
-          <w:tcPr>
-            <w:tcW w:type="dxa" w:w="5400"/>
-          </w:tcPr>
-          <w:p>
-            <w:r>
-              <w:t xml:space="preserve">complete() -&gt; verified: true, correct bytes</w:t>
-            </w:r>
-          </w:p>
-        </w:tc>
-        <w:tc>
-          <w:tcPr>
-            <w:tcW w:type="dxa" w:w="1200"/>
-          </w:tcPr>
-          <w:p>
-            <w:r>
-              <w:t xml:space="preserve"/>
-            </w:r>
-          </w:p>
-        </w:tc>
-        <w:tc>
-          <w:tcPr>
-            <w:tcW w:type="dxa" w:w="1200"/>
-          </w:tcPr>
-          <w:p>
-            <w:r>
-              <w:t xml:space="preserve"/>
-            </w:r>
-          </w:p>
-        </w:tc>
-        <w:tc>
-          <w:tcPr>
-            <w:tcW w:type="dxa" w:w="1560"/>
-          </w:tcPr>
-          <w:p>
-            <w:r>
-              <w:t xml:space="preserve"/>
-            </w:r>
-          </w:p>
-        </w:tc>
       </w:tr>
       <w:tr>
         <w:tc>
@@ -1969,27 +1969,27 @@
           </w:tcPr>
           <w:p>
             <w:r>
-              <w:t xml:space="preserve"/>
-            </w:r>
-          </w:p>
-        </w:tc>
-        <w:tc>
-          <w:tcPr>
-            <w:tcW w:type="dxa" w:w="1200"/>
-          </w:tcPr>
-          <w:p>
-            <w:r>
-              <w:t xml:space="preserve"/>
-            </w:r>
-          </w:p>
-        </w:tc>
-        <w:tc>
-          <w:tcPr>
-            <w:tcW w:type="dxa" w:w="1560"/>
-          </w:tcPr>
-          <w:p>
-            <w:r>
-              <w:t xml:space="preserve"/>
+              <w:t xml:space="preserve">✓</w:t>
+            </w:r>
+          </w:p>
+        </w:tc>
+        <w:tc>
+          <w:tcPr>
+            <w:tcW w:type="dxa" w:w="1200"/>
+          </w:tcPr>
+          <w:p>
+            <w:r>
+              <w:t xml:space="preserve">8/9/2026</w:t>
+            </w:r>
+          </w:p>
+        </w:tc>
+        <w:tc>
+          <w:tcPr>
+            <w:tcW w:type="dxa" w:w="1560"/>
+          </w:tcPr>
+          <w:p>
+            <w:r>
+              <w:t xml:space="preserve">create -&gt; PUT -&gt; complete confirmed via call_logs</w:t>
             </w:r>
           </w:p>
         </w:tc>
@@ -2011,27 +2011,27 @@
           </w:tcPr>
           <w:p>
             <w:r>
-              <w:t xml:space="preserve"/>
-            </w:r>
-          </w:p>
-        </w:tc>
-        <w:tc>
-          <w:tcPr>
-            <w:tcW w:type="dxa" w:w="1200"/>
-          </w:tcPr>
-          <w:p>
-            <w:r>
-              <w:t xml:space="preserve"/>
-            </w:r>
-          </w:p>
-        </w:tc>
-        <w:tc>
-          <w:tcPr>
-            <w:tcW w:type="dxa" w:w="1560"/>
-          </w:tcPr>
-          <w:p>
-            <w:r>
-              <w:t xml:space="preserve"/>
+              <w:t xml:space="preserve">✓</w:t>
+            </w:r>
+          </w:p>
+        </w:tc>
+        <w:tc>
+          <w:tcPr>
+            <w:tcW w:type="dxa" w:w="1200"/>
+          </w:tcPr>
+          <w:p>
+            <w:r>
+              <w:t xml:space="preserve">8/9/2026</w:t>
+            </w:r>
+          </w:p>
+        </w:tc>
+        <w:tc>
+          <w:tcPr>
+            <w:tcW w:type="dxa" w:w="1560"/>
+          </w:tcPr>
+          <w:p>
+            <w:r>
+              <w:t xml:space="preserve">Presigned GetObject URL confirmed</w:t>
             </w:r>
           </w:p>
         </w:tc>
@@ -2053,27 +2053,27 @@
           </w:tcPr>
           <w:p>
             <w:r>
-              <w:t xml:space="preserve"/>
-            </w:r>
-          </w:p>
-        </w:tc>
-        <w:tc>
-          <w:tcPr>
-            <w:tcW w:type="dxa" w:w="1200"/>
-          </w:tcPr>
-          <w:p>
-            <w:r>
-              <w:t xml:space="preserve"/>
-            </w:r>
-          </w:p>
-        </w:tc>
-        <w:tc>
-          <w:tcPr>
-            <w:tcW w:type="dxa" w:w="1560"/>
-          </w:tcPr>
-          <w:p>
-            <w:r>
-              <w:t xml:space="preserve"/>
+              <w:t xml:space="preserve">✓</w:t>
+            </w:r>
+          </w:p>
+        </w:tc>
+        <w:tc>
+          <w:tcPr>
+            <w:tcW w:type="dxa" w:w="1200"/>
+          </w:tcPr>
+          <w:p>
+            <w:r>
+              <w:t xml:space="preserve">8/9/2026</w:t>
+            </w:r>
+          </w:p>
+        </w:tc>
+        <w:tc>
+          <w:tcPr>
+            <w:tcW w:type="dxa" w:w="1560"/>
+          </w:tcPr>
+          <w:p>
+            <w:r>
+              <w:t xml:space="preserve">log_id 181, same storage_key as create</w:t>
             </w:r>
           </w:p>
         </w:tc>
@@ -2095,27 +2095,27 @@
           </w:tcPr>
           <w:p>
             <w:r>
-              <w:t xml:space="preserve"/>
-            </w:r>
-          </w:p>
-        </w:tc>
-        <w:tc>
-          <w:tcPr>
-            <w:tcW w:type="dxa" w:w="1200"/>
-          </w:tcPr>
-          <w:p>
-            <w:r>
-              <w:t xml:space="preserve"/>
-            </w:r>
-          </w:p>
-        </w:tc>
-        <w:tc>
-          <w:tcPr>
-            <w:tcW w:type="dxa" w:w="1560"/>
-          </w:tcPr>
-          <w:p>
-            <w:r>
-              <w:t xml:space="preserve"/>
+              <w:t xml:space="preserve">✓</w:t>
+            </w:r>
+          </w:p>
+        </w:tc>
+        <w:tc>
+          <w:tcPr>
+            <w:tcW w:type="dxa" w:w="1200"/>
+          </w:tcPr>
+          <w:p>
+            <w:r>
+              <w:t xml:space="preserve">8/9/2026</w:t>
+            </w:r>
+          </w:p>
+        </w:tc>
+        <w:tc>
+          <w:tcPr>
+            <w:tcW w:type="dxa" w:w="1560"/>
+          </w:tcPr>
+          <w:p>
+            <w:r>
+              <w:t xml:space="preserve">log_id 182, success:true</w:t>
             </w:r>
           </w:p>
         </w:tc>
@@ -2137,27 +2137,27 @@
           </w:tcPr>
           <w:p>
             <w:r>
-              <w:t xml:space="preserve"/>
-            </w:r>
-          </w:p>
-        </w:tc>
-        <w:tc>
-          <w:tcPr>
-            <w:tcW w:type="dxa" w:w="1200"/>
-          </w:tcPr>
-          <w:p>
-            <w:r>
-              <w:t xml:space="preserve"/>
-            </w:r>
-          </w:p>
-        </w:tc>
-        <w:tc>
-          <w:tcPr>
-            <w:tcW w:type="dxa" w:w="1560"/>
-          </w:tcPr>
-          <w:p>
-            <w:r>
-              <w:t xml:space="preserve"/>
+              <w:t xml:space="preserve">✓</w:t>
+            </w:r>
+          </w:p>
+        </w:tc>
+        <w:tc>
+          <w:tcPr>
+            <w:tcW w:type="dxa" w:w="1200"/>
+          </w:tcPr>
+          <w:p>
+            <w:r>
+              <w:t xml:space="preserve">8/9/2026</w:t>
+            </w:r>
+          </w:p>
+        </w:tc>
+        <w:tc>
+          <w:tcPr>
+            <w:tcW w:type="dxa" w:w="1560"/>
+          </w:tcPr>
+          <w:p>
+            <w:r>
+              <w:t xml:space="preserve">Both read() and upload() paths confirmed</w:t>
             </w:r>
           </w:p>
         </w:tc>
@@ -2179,27 +2179,27 @@
           </w:tcPr>
           <w:p>
             <w:r>
-              <w:t xml:space="preserve"/>
-            </w:r>
-          </w:p>
-        </w:tc>
-        <w:tc>
-          <w:tcPr>
-            <w:tcW w:type="dxa" w:w="1200"/>
-          </w:tcPr>
-          <w:p>
-            <w:r>
-              <w:t xml:space="preserve"/>
-            </w:r>
-          </w:p>
-        </w:tc>
-        <w:tc>
-          <w:tcPr>
-            <w:tcW w:type="dxa" w:w="1560"/>
-          </w:tcPr>
-          <w:p>
-            <w:r>
-              <w:t xml:space="preserve">Cross-check against Phase 4 token bucket params</w:t>
+              <w:t xml:space="preserve">✓</w:t>
+            </w:r>
+          </w:p>
+        </w:tc>
+        <w:tc>
+          <w:tcPr>
+            <w:tcW w:type="dxa" w:w="1200"/>
+          </w:tcPr>
+          <w:p>
+            <w:r>
+              <w:t xml:space="preserve">8/9/2026</w:t>
+            </w:r>
+          </w:p>
+        </w:tc>
+        <w:tc>
+          <w:tcPr>
+            <w:tcW w:type="dxa" w:w="1560"/>
+          </w:tcPr>
+          <w:p>
+            <w:r>
+              <w:t xml:space="preserve">8 concurrent reads: 5 succeed, 2 throttled, retryAfterMs numeric both times</w:t>
             </w:r>
           </w:p>
         </w:tc>
@@ -2221,27 +2221,27 @@
           </w:tcPr>
           <w:p>
             <w:r>
-              <w:t xml:space="preserve"/>
-            </w:r>
-          </w:p>
-        </w:tc>
-        <w:tc>
-          <w:tcPr>
-            <w:tcW w:type="dxa" w:w="1200"/>
-          </w:tcPr>
-          <w:p>
-            <w:r>
-              <w:t xml:space="preserve"/>
-            </w:r>
-          </w:p>
-        </w:tc>
-        <w:tc>
-          <w:tcPr>
-            <w:tcW w:type="dxa" w:w="1560"/>
-          </w:tcPr>
-          <w:p>
-            <w:r>
-              <w:t xml:space="preserve"/>
+              <w:t xml:space="preserve">✓</w:t>
+            </w:r>
+          </w:p>
+        </w:tc>
+        <w:tc>
+          <w:tcPr>
+            <w:tcW w:type="dxa" w:w="1200"/>
+          </w:tcPr>
+          <w:p>
+            <w:r>
+              <w:t xml:space="preserve">8/9/2026</w:t>
+            </w:r>
+          </w:p>
+        </w:tc>
+        <w:tc>
+          <w:tcPr>
+            <w:tcW w:type="dxa" w:w="1560"/>
+          </w:tcPr>
+          <w:p>
+            <w:r>
+              <w:t xml:space="preserve">Cross-checked against Supabase call_logs export throughout</w:t>
             </w:r>
           </w:p>
         </w:tc>
@@ -2356,27 +2356,27 @@
           </w:tcPr>
           <w:p>
             <w:r>
-              <w:t xml:space="preserve"/>
-            </w:r>
-          </w:p>
-        </w:tc>
-        <w:tc>
-          <w:tcPr>
-            <w:tcW w:type="dxa" w:w="1200"/>
-          </w:tcPr>
-          <w:p>
-            <w:r>
-              <w:t xml:space="preserve"/>
-            </w:r>
-          </w:p>
-        </w:tc>
-        <w:tc>
-          <w:tcPr>
-            <w:tcW w:type="dxa" w:w="1560"/>
-          </w:tcPr>
-          <w:p>
-            <w:r>
-              <w:t xml:space="preserve"/>
+              <w:t xml:space="preserve">✓</w:t>
+            </w:r>
+          </w:p>
+        </w:tc>
+        <w:tc>
+          <w:tcPr>
+            <w:tcW w:type="dxa" w:w="1200"/>
+          </w:tcPr>
+          <w:p>
+            <w:r>
+              <w:t xml:space="preserve">8/9/2026</w:t>
+            </w:r>
+          </w:p>
+        </w:tc>
+        <w:tc>
+          <w:tcPr>
+            <w:tcW w:type="dxa" w:w="1560"/>
+          </w:tcPr>
+          <w:p>
+            <w:r>
+              <w:t xml:space="preserve">v1.0.0 tagged and pushed</w:t>
             </w:r>
           </w:p>
         </w:tc>
@@ -2398,27 +2398,153 @@
           </w:tcPr>
           <w:p>
             <w:r>
-              <w:t xml:space="preserve"/>
-            </w:r>
-          </w:p>
-        </w:tc>
-        <w:tc>
-          <w:tcPr>
-            <w:tcW w:type="dxa" w:w="1200"/>
-          </w:tcPr>
-          <w:p>
-            <w:r>
-              <w:t xml:space="preserve"/>
-            </w:r>
-          </w:p>
-        </w:tc>
-        <w:tc>
-          <w:tcPr>
-            <w:tcW w:type="dxa" w:w="1560"/>
-          </w:tcPr>
-          <w:p>
-            <w:r>
-              <w:t xml:space="preserve"/>
+              <w:t xml:space="preserve">✓</w:t>
+            </w:r>
+          </w:p>
+        </w:tc>
+        <w:tc>
+          <w:tcPr>
+            <w:tcW w:type="dxa" w:w="1200"/>
+          </w:tcPr>
+          <w:p>
+            <w:r>
+              <w:t xml:space="preserve">8/9/2026</w:t>
+            </w:r>
+          </w:p>
+        </w:tc>
+        <w:tc>
+          <w:tcPr>
+            <w:tcW w:type="dxa" w:w="1560"/>
+          </w:tcPr>
+          <w:p>
+            <w:r>
+              <w:t xml:space="preserve">npm install Dev-Njagi-James/...#v1.0.0 confirmed from Git Bash, version 1.0.0 verified</w:t>
+            </w:r>
+          </w:p>
+        </w:tc>
+      </w:tr>
+      <w:tr>
+        <w:tc>
+          <w:tcPr>
+            <w:tcW w:type="dxa" w:w="5400"/>
+          </w:tcPr>
+          <w:p>
+            <w:r>
+              <w:t xml:space="preserve">Published to npm registry</w:t>
+            </w:r>
+          </w:p>
+        </w:tc>
+        <w:tc>
+          <w:tcPr>
+            <w:tcW w:type="dxa" w:w="1200"/>
+          </w:tcPr>
+          <w:p>
+            <w:r>
+              <w:t xml:space="preserve">✓</w:t>
+            </w:r>
+          </w:p>
+        </w:tc>
+        <w:tc>
+          <w:tcPr>
+            <w:tcW w:type="dxa" w:w="1200"/>
+          </w:tcPr>
+          <w:p>
+            <w:r>
+              <w:t xml:space="preserve">8/8/2026</w:t>
+            </w:r>
+          </w:p>
+        </w:tc>
+        <w:tc>
+          <w:tcPr>
+            <w:tcW w:type="dxa" w:w="1560"/>
+          </w:tcPr>
+          <w:p>
+            <w:r>
+              <w:t xml:space="preserve">@stravon/scale-sdk@1.0.0, public access, npmjs.com/package/@stravon/scale-sdk</w:t>
+            </w:r>
+          </w:p>
+        </w:tc>
+      </w:tr>
+      <w:tr>
+        <w:tc>
+          <w:tcPr>
+            <w:tcW w:type="dxa" w:w="5400"/>
+          </w:tcPr>
+          <w:p>
+            <w:r>
+              <w:t xml:space="preserve">Registry install confirmed (npm install @stravon/scale-sdk works)</w:t>
+            </w:r>
+          </w:p>
+        </w:tc>
+        <w:tc>
+          <w:tcPr>
+            <w:tcW w:type="dxa" w:w="1200"/>
+          </w:tcPr>
+          <w:p>
+            <w:r>
+              <w:t xml:space="preserve">✓</w:t>
+            </w:r>
+          </w:p>
+        </w:tc>
+        <w:tc>
+          <w:tcPr>
+            <w:tcW w:type="dxa" w:w="1200"/>
+          </w:tcPr>
+          <w:p>
+            <w:r>
+              <w:t xml:space="preserve">8/9/2026</w:t>
+            </w:r>
+          </w:p>
+        </w:tc>
+        <w:tc>
+          <w:tcPr>
+            <w:tcW w:type="dxa" w:w="1560"/>
+          </w:tcPr>
+          <w:p>
+            <w:r>
+              <w:t xml:space="preserve">Verified in clean test folder</w:t>
+            </w:r>
+          </w:p>
+        </w:tc>
+      </w:tr>
+      <w:tr>
+        <w:tc>
+          <w:tcPr>
+            <w:tcW w:type="dxa" w:w="5400"/>
+          </w:tcPr>
+          <w:p>
+            <w:r>
+              <w:t xml:space="preserve">dist/ committed to repo for git-installable distribution</w:t>
+            </w:r>
+          </w:p>
+        </w:tc>
+        <w:tc>
+          <w:tcPr>
+            <w:tcW w:type="dxa" w:w="1200"/>
+          </w:tcPr>
+          <w:p>
+            <w:r>
+              <w:t xml:space="preserve">✓</w:t>
+            </w:r>
+          </w:p>
+        </w:tc>
+        <w:tc>
+          <w:tcPr>
+            <w:tcW w:type="dxa" w:w="1200"/>
+          </w:tcPr>
+          <w:p>
+            <w:r>
+              <w:t xml:space="preserve">8/9/2026</w:t>
+            </w:r>
+          </w:p>
+        </w:tc>
+        <w:tc>
+          <w:tcPr>
+            <w:tcW w:type="dxa" w:w="1560"/>
+          </w:tcPr>
+          <w:p>
+            <w:r>
+              <w:t xml:space="preserve">.gitignore updated to stop excluding dist/</w:t>
             </w:r>
           </w:p>
         </w:tc>
@@ -2430,7 +2556,184 @@
         <w:spacing w:after="120" w:before="240"/>
       </w:pPr>
       <w:r>
-        <w:t xml:space="preserve">SDK v1 Exit Criteria</w:t>
+        <w:t xml:space="preserve">Documentation</w:t>
+      </w:r>
+    </w:p>
+    <w:tbl>
+      <w:tblPr>
+        <w:tblW w:type="dxa" w:w="9360"/>
+        <w:tblBorders>
+          <w:top w:val="single" w:color="auto" w:sz="4"/>
+          <w:left w:val="single" w:color="auto" w:sz="4"/>
+          <w:bottom w:val="single" w:color="auto" w:sz="4"/>
+          <w:right w:val="single" w:color="auto" w:sz="4"/>
+          <w:insideH w:val="single" w:color="auto" w:sz="4"/>
+          <w:insideV w:val="single" w:color="auto" w:sz="4"/>
+        </w:tblBorders>
+      </w:tblPr>
+      <w:tblGrid>
+        <w:gridCol w:w="5400"/>
+        <w:gridCol w:w="1200"/>
+        <w:gridCol w:w="1200"/>
+        <w:gridCol w:w="1560"/>
+      </w:tblGrid>
+      <w:tr>
+        <w:trPr>
+          <w:tblHeader/>
+        </w:trPr>
+        <w:tc>
+          <w:tcPr>
+            <w:tcW w:type="dxa" w:w="5400"/>
+            <w:shd w:fill="D9D9D9" w:val="clear"/>
+          </w:tcPr>
+          <w:p>
+            <w:r>
+              <w:rPr>
+                <w:b/>
+                <w:bCs/>
+              </w:rPr>
+              <w:t xml:space="preserve">Item</w:t>
+            </w:r>
+          </w:p>
+        </w:tc>
+        <w:tc>
+          <w:tcPr>
+            <w:tcW w:type="dxa" w:w="1200"/>
+            <w:shd w:fill="D9D9D9" w:val="clear"/>
+          </w:tcPr>
+          <w:p>
+            <w:r>
+              <w:rPr>
+                <w:b/>
+                <w:bCs/>
+              </w:rPr>
+              <w:t xml:space="preserve">Done (✓)</w:t>
+            </w:r>
+          </w:p>
+        </w:tc>
+        <w:tc>
+          <w:tcPr>
+            <w:tcW w:type="dxa" w:w="1200"/>
+            <w:shd w:fill="D9D9D9" w:val="clear"/>
+          </w:tcPr>
+          <w:p>
+            <w:r>
+              <w:rPr>
+                <w:b/>
+                <w:bCs/>
+              </w:rPr>
+              <w:t xml:space="preserve">Date</w:t>
+            </w:r>
+          </w:p>
+        </w:tc>
+        <w:tc>
+          <w:tcPr>
+            <w:tcW w:type="dxa" w:w="1560"/>
+            <w:shd w:fill="D9D9D9" w:val="clear"/>
+          </w:tcPr>
+          <w:p>
+            <w:r>
+              <w:rPr>
+                <w:b/>
+                <w:bCs/>
+              </w:rPr>
+              <w:t xml:space="preserve">Notes</w:t>
+            </w:r>
+          </w:p>
+        </w:tc>
+      </w:tr>
+      <w:tr>
+        <w:tc>
+          <w:tcPr>
+            <w:tcW w:type="dxa" w:w="5400"/>
+          </w:tcPr>
+          <w:p>
+            <w:r>
+              <w:t xml:space="preserve">README.md created with install, quickstart, API reference, error handling, config</w:t>
+            </w:r>
+          </w:p>
+        </w:tc>
+        <w:tc>
+          <w:tcPr>
+            <w:tcW w:type="dxa" w:w="1200"/>
+          </w:tcPr>
+          <w:p>
+            <w:r>
+              <w:t xml:space="preserve">✓</w:t>
+            </w:r>
+          </w:p>
+        </w:tc>
+        <w:tc>
+          <w:tcPr>
+            <w:tcW w:type="dxa" w:w="1200"/>
+          </w:tcPr>
+          <w:p>
+            <w:r>
+              <w:t xml:space="preserve">8/8/2026</w:t>
+            </w:r>
+          </w:p>
+        </w:tc>
+        <w:tc>
+          <w:tcPr>
+            <w:tcW w:type="dxa" w:w="1560"/>
+          </w:tcPr>
+          <w:p>
+            <w:r>
+              <w:t xml:space="preserve">Both install methods documented (registry + GitHub tag)</w:t>
+            </w:r>
+          </w:p>
+        </w:tc>
+      </w:tr>
+      <w:tr>
+        <w:tc>
+          <w:tcPr>
+            <w:tcW w:type="dxa" w:w="5400"/>
+          </w:tcPr>
+          <w:p>
+            <w:r>
+              <w:t xml:space="preserve">upload() error-typing caveat documented (plain Error on PUT failure)</w:t>
+            </w:r>
+          </w:p>
+        </w:tc>
+        <w:tc>
+          <w:tcPr>
+            <w:tcW w:type="dxa" w:w="1200"/>
+          </w:tcPr>
+          <w:p>
+            <w:r>
+              <w:t xml:space="preserve">✓</w:t>
+            </w:r>
+          </w:p>
+        </w:tc>
+        <w:tc>
+          <w:tcPr>
+            <w:tcW w:type="dxa" w:w="1200"/>
+          </w:tcPr>
+          <w:p>
+            <w:r>
+              <w:t xml:space="preserve">8/8/2026</w:t>
+            </w:r>
+          </w:p>
+        </w:tc>
+        <w:tc>
+          <w:tcPr>
+            <w:tcW w:type="dxa" w:w="1560"/>
+          </w:tcPr>
+          <w:p>
+            <w:r>
+              <w:t xml:space="preserve">Explicit note in README</w:t>
+            </w:r>
+          </w:p>
+        </w:tc>
+      </w:tr>
+    </w:tbl>
+    <w:p>
+      <w:pPr>
+        <w:pStyle w:val="Heading1"/>
+        <w:spacing w:after="120" w:before="240"/>
+      </w:pPr>
+      <w:r>
+        <w:t xml:space="preserve">SDK v1 Exit Criteria — MET</w:t>
       </w:r>
     </w:p>
     <w:p>
@@ -2438,7 +2741,7 @@
         <w:spacing w:after="120"/>
       </w:pPr>
       <w:r>
-        <w:t xml:space="preserve">All five storage methods plus upload() built, typed, and verified against the live backend with a real project API key. All five error classes reproduced and confirmed. Distribution confirmed git-installable with independent semver tagging. Auth-route coverage explicitly out of scope — deferred to SDK v2.</w:t>
+        <w:t xml:space="preserve">All five storage methods plus upload() built, typed, and verified against the live backend with a real project API key. All six error classes reproduced and confirmed (ScaleError base + AuthError, RateLimitError, ValidationError, ServerError, TimeoutError). Distribution confirmed via both the npm registry (@stravon/scale-sdk) and git-tag install, each independently verified with real terminal output. Auth-route coverage explicitly out of scope — deferred to SDK v2, gated on Phase 4 auth-route rate-limiting verification landing in the backend.</w:t>
       </w:r>
     </w:p>
     <w:p>
@@ -2447,7 +2750,7 @@
         <w:spacing w:after="120" w:before="240"/>
       </w:pPr>
       <w:r>
-        <w:t xml:space="preserve">Still Open</w:t>
+        <w:t xml:space="preserve">Known Open Items (do not block SDK v1 closure)</w:t>
       </w:r>
     </w:p>
     <w:p>
@@ -2455,7 +2758,7 @@
         <w:spacing w:after="120"/>
       </w:pPr>
       <w:r>
-        <w:t xml:space="preserve">— Default timeout value for TimeoutError not yet decided.</w:t>
+        <w:t xml:space="preserve">— storage.read() returns the UUID as filename instead of the original filename — identified as a backend bug in storage.controller.ts's readFile handler, not an SDK defect. Flagged for backend investigation.</w:t>
       </w:r>
     </w:p>
     <w:p>
@@ -2463,7 +2766,7 @@
         <w:spacing w:after="120"/>
       </w:pPr>
       <w:r>
-        <w:t xml:space="preserve">— RateLimitError body shape not yet cross-checked against the backend's actual live 429 response.</w:t>
+        <w:t xml:space="preserve">— CDN / Smart Tiered Cache rollout not yet actioned — pinned as pre-Phase-6 gate in the Structure doc, includes an undecided nameserver/subdomain migration. To be addressed as its own separate topic.</w:t>
       </w:r>
     </w:p>
     <w:p>
@@ -2471,7 +2774,7 @@
         <w:spacing w:after="120"/>
       </w:pPr>
       <w:r>
-        <w:t xml:space="preserve">— SDK v2 scope (auth routes) blocked on Phase 4 auth-route rate-limiting verification landing in the backend.</w:t>
+        <w:t xml:space="preserve">— SDK v2 (auth-route coverage) blocked on Phase 4 auth-route rate-limiting verification, which remains open per the Phase 4 checklist.</w:t>
       </w:r>
     </w:p>
     <w:sectPr>

</xml_diff>